<commit_message>
add some in chapter 5
</commit_message>
<xml_diff>
--- a/2311.02775v3译文.docx
+++ b/2311.02775v3译文.docx
@@ -6,7 +6,7 @@
       <w:pPr>
         <w:jc w:val="center"/>
         <w:rPr>
-          <w:rFonts w:ascii="黑体" w:eastAsia="黑体" w:hAnsi="黑体" w:hint="eastAsia"/>
+          <w:rFonts w:ascii="黑体" w:eastAsia="黑体" w:hAnsi="黑体"/>
           <w:b/>
           <w:bCs/>
           <w:sz w:val="48"/>
@@ -28,24 +28,60 @@
       <w:pPr>
         <w:jc w:val="center"/>
         <w:rPr>
+          <w:rFonts w:ascii="楷体" w:eastAsia="楷体" w:hAnsi="楷体"/>
+          <w:sz w:val="28"/>
+          <w:szCs w:val="28"/>
+        </w:rPr>
+      </w:pPr>
+      <w:r>
+        <w:rPr>
           <w:rFonts w:ascii="楷体" w:eastAsia="楷体" w:hAnsi="楷体" w:hint="eastAsia"/>
           <w:sz w:val="28"/>
           <w:szCs w:val="28"/>
         </w:rPr>
-      </w:pPr>
+        <w:t xml:space="preserve">作者 Yann </w:t>
+      </w:r>
+      <w:proofErr w:type="spellStart"/>
       <w:r>
         <w:rPr>
           <w:rFonts w:ascii="楷体" w:eastAsia="楷体" w:hAnsi="楷体" w:hint="eastAsia"/>
           <w:sz w:val="28"/>
           <w:szCs w:val="28"/>
         </w:rPr>
-        <w:t>作者 Yann Hicke, Anmol Agarwal, Qianou(Christina) Ma, Paul Denny</w:t>
-      </w:r>
-    </w:p>
-    <w:p>
-      <w:pPr>
-        <w:rPr>
-          <w:rFonts w:ascii="宋体" w:eastAsia="宋体" w:hAnsi="宋体" w:hint="eastAsia"/>
+        <w:t>Hicke</w:t>
+      </w:r>
+      <w:proofErr w:type="spellEnd"/>
+      <w:r>
+        <w:rPr>
+          <w:rFonts w:ascii="楷体" w:eastAsia="楷体" w:hAnsi="楷体" w:hint="eastAsia"/>
+          <w:sz w:val="28"/>
+          <w:szCs w:val="28"/>
+        </w:rPr>
+        <w:t xml:space="preserve">, Anmol Agarwal, </w:t>
+      </w:r>
+      <w:proofErr w:type="spellStart"/>
+      <w:r>
+        <w:rPr>
+          <w:rFonts w:ascii="楷体" w:eastAsia="楷体" w:hAnsi="楷体" w:hint="eastAsia"/>
+          <w:sz w:val="28"/>
+          <w:szCs w:val="28"/>
+        </w:rPr>
+        <w:t>Qianou</w:t>
+      </w:r>
+      <w:proofErr w:type="spellEnd"/>
+      <w:r>
+        <w:rPr>
+          <w:rFonts w:ascii="楷体" w:eastAsia="楷体" w:hAnsi="楷体" w:hint="eastAsia"/>
+          <w:sz w:val="28"/>
+          <w:szCs w:val="28"/>
+        </w:rPr>
+        <w:t>(Christina) Ma, Paul Denny</w:t>
+      </w:r>
+    </w:p>
+    <w:p>
+      <w:pPr>
+        <w:rPr>
+          <w:rFonts w:ascii="宋体" w:eastAsia="宋体" w:hAnsi="宋体"/>
           <w:b/>
           <w:bCs/>
           <w:sz w:val="24"/>
@@ -106,7 +142,7 @@
     <w:p>
       <w:pPr>
         <w:rPr>
-          <w:rFonts w:ascii="宋体" w:eastAsia="宋体" w:hAnsi="宋体" w:hint="eastAsia"/>
+          <w:rFonts w:ascii="宋体" w:eastAsia="宋体" w:hAnsi="宋体"/>
           <w:sz w:val="24"/>
           <w:szCs w:val="24"/>
         </w:rPr>
@@ -115,7 +151,7 @@
     <w:p>
       <w:pPr>
         <w:rPr>
-          <w:rFonts w:ascii="宋体" w:eastAsia="宋体" w:hAnsi="宋体" w:hint="eastAsia"/>
+          <w:rFonts w:ascii="宋体" w:eastAsia="宋体" w:hAnsi="宋体"/>
           <w:b/>
           <w:bCs/>
           <w:sz w:val="28"/>
@@ -147,18 +183,36 @@
       <w:pPr>
         <w:ind w:firstLineChars="200" w:firstLine="560"/>
         <w:rPr>
-          <w:rFonts w:ascii="宋体" w:eastAsia="宋体" w:hAnsi="宋体" w:hint="eastAsia"/>
-          <w:sz w:val="28"/>
-          <w:szCs w:val="28"/>
-        </w:rPr>
-      </w:pPr>
-      <w:r>
-        <w:rPr>
-          <w:rFonts w:ascii="宋体" w:eastAsia="宋体" w:hAnsi="宋体" w:hint="eastAsia"/>
-          <w:sz w:val="28"/>
-          <w:szCs w:val="28"/>
-        </w:rPr>
-        <w:t>在线的问答（QA）平台，以Piazza或EdStem为例，已经成为日常广泛使用。它们常常被教师用于及时传递信息，有效地向学生回答关于课程信息的具体内容，以及一些班级管理事务。</w:t>
+          <w:rFonts w:ascii="宋体" w:eastAsia="宋体" w:hAnsi="宋体"/>
+          <w:sz w:val="28"/>
+          <w:szCs w:val="28"/>
+        </w:rPr>
+      </w:pPr>
+      <w:r>
+        <w:rPr>
+          <w:rFonts w:ascii="宋体" w:eastAsia="宋体" w:hAnsi="宋体" w:hint="eastAsia"/>
+          <w:sz w:val="28"/>
+          <w:szCs w:val="28"/>
+        </w:rPr>
+        <w:t>在线的问答（QA）平台，以Piazza或</w:t>
+      </w:r>
+      <w:proofErr w:type="spellStart"/>
+      <w:r>
+        <w:rPr>
+          <w:rFonts w:ascii="宋体" w:eastAsia="宋体" w:hAnsi="宋体" w:hint="eastAsia"/>
+          <w:sz w:val="28"/>
+          <w:szCs w:val="28"/>
+        </w:rPr>
+        <w:t>EdStem</w:t>
+      </w:r>
+      <w:proofErr w:type="spellEnd"/>
+      <w:r>
+        <w:rPr>
+          <w:rFonts w:ascii="宋体" w:eastAsia="宋体" w:hAnsi="宋体" w:hint="eastAsia"/>
+          <w:sz w:val="28"/>
+          <w:szCs w:val="28"/>
+        </w:rPr>
+        <w:t>为例，已经成为日常广泛使用。它们常常被教师用于及时传递信息，有效地向学生回答关于课程信息的具体内容，以及一些班级管理事务。</w:t>
       </w:r>
       <w:r>
         <w:rPr>
@@ -208,7 +262,25 @@
           <w:sz w:val="28"/>
           <w:szCs w:val="28"/>
         </w:rPr>
-        <w:t>近期提出的一些解决这个问题的方法揭示了许多局限性。例如，在2015年佐治亚理工（GeorgiaTech）推出了Jill Watson AI模型；这个模型依靠本体论框架和数据中心的问答对组合，</w:t>
+        <w:t>近期提出的一些解决这个问题的方法揭示了许多局限性。例如，在2015年佐治亚理工（</w:t>
+      </w:r>
+      <w:proofErr w:type="spellStart"/>
+      <w:r>
+        <w:rPr>
+          <w:rFonts w:ascii="宋体" w:eastAsia="宋体" w:hAnsi="宋体" w:hint="eastAsia"/>
+          <w:sz w:val="28"/>
+          <w:szCs w:val="28"/>
+        </w:rPr>
+        <w:t>GeorgiaTech</w:t>
+      </w:r>
+      <w:proofErr w:type="spellEnd"/>
+      <w:r>
+        <w:rPr>
+          <w:rFonts w:ascii="宋体" w:eastAsia="宋体" w:hAnsi="宋体" w:hint="eastAsia"/>
+          <w:sz w:val="28"/>
+          <w:szCs w:val="28"/>
+        </w:rPr>
+        <w:t>）推出了Jill Watson AI模型；这个模型依靠本体论框架和数据中心的问答对组合，</w:t>
       </w:r>
       <w:r>
         <w:rPr>
@@ -323,6 +395,7 @@
         </w:rPr>
         <w:t>。可汗学院的</w:t>
       </w:r>
+      <w:proofErr w:type="spellStart"/>
       <w:r>
         <w:rPr>
           <w:rFonts w:ascii="Cambria" w:eastAsia="宋体" w:hAnsi="Cambria" w:cs="Cambria" w:hint="eastAsia"/>
@@ -331,6 +404,7 @@
         </w:rPr>
         <w:t>Khanmigo</w:t>
       </w:r>
+      <w:proofErr w:type="spellEnd"/>
       <w:r>
         <w:rPr>
           <w:rFonts w:ascii="Cambria" w:eastAsia="宋体" w:hAnsi="Cambria" w:cs="Cambria" w:hint="eastAsia"/>
@@ -368,7 +442,7 @@
       <w:pPr>
         <w:ind w:firstLineChars="200" w:firstLine="560"/>
         <w:rPr>
-          <w:rFonts w:ascii="宋体" w:eastAsia="宋体" w:hAnsi="宋体" w:hint="eastAsia"/>
+          <w:rFonts w:ascii="宋体" w:eastAsia="宋体" w:hAnsi="宋体"/>
           <w:sz w:val="28"/>
           <w:szCs w:val="28"/>
         </w:rPr>
@@ -410,7 +484,7 @@
       <w:pPr>
         <w:ind w:firstLineChars="200" w:firstLine="560"/>
         <w:rPr>
-          <w:rFonts w:ascii="宋体" w:eastAsia="宋体" w:hAnsi="宋体" w:hint="eastAsia"/>
+          <w:rFonts w:ascii="宋体" w:eastAsia="宋体" w:hAnsi="宋体"/>
           <w:sz w:val="28"/>
           <w:szCs w:val="28"/>
         </w:rPr>
@@ -432,7 +506,7 @@
           <w:numId w:val="3"/>
         </w:numPr>
         <w:rPr>
-          <w:rFonts w:ascii="宋体" w:eastAsia="宋体" w:hAnsi="宋体" w:hint="eastAsia"/>
+          <w:rFonts w:ascii="宋体" w:eastAsia="宋体" w:hAnsi="宋体"/>
           <w:sz w:val="28"/>
           <w:szCs w:val="28"/>
         </w:rPr>
@@ -462,7 +536,7 @@
           <w:numId w:val="3"/>
         </w:numPr>
         <w:rPr>
-          <w:rFonts w:ascii="宋体" w:eastAsia="宋体" w:hAnsi="宋体" w:hint="eastAsia"/>
+          <w:rFonts w:ascii="宋体" w:eastAsia="宋体" w:hAnsi="宋体"/>
           <w:sz w:val="28"/>
           <w:szCs w:val="28"/>
         </w:rPr>
@@ -485,7 +559,7 @@
           <w:numId w:val="3"/>
         </w:numPr>
         <w:rPr>
-          <w:rFonts w:ascii="宋体" w:eastAsia="宋体" w:hAnsi="宋体" w:hint="eastAsia"/>
+          <w:rFonts w:ascii="宋体" w:eastAsia="宋体" w:hAnsi="宋体"/>
           <w:sz w:val="28"/>
           <w:szCs w:val="28"/>
         </w:rPr>
@@ -502,9 +576,6 @@
     <w:p>
       <w:pPr>
         <w:keepNext/>
-        <w:rPr>
-          <w:rFonts w:hint="eastAsia"/>
-        </w:rPr>
       </w:pPr>
       <w:r>
         <w:rPr>
@@ -550,174 +621,171 @@
     <w:p>
       <w:pPr>
         <w:pStyle w:val="ae"/>
+      </w:pPr>
+      <w:r>
+        <w:t>图</w:t>
+      </w:r>
+      <w:r>
+        <w:t xml:space="preserve"> </w:t>
+      </w:r>
+      <w:r>
+        <w:fldChar w:fldCharType="begin"/>
+      </w:r>
+      <w:r>
+        <w:instrText xml:space="preserve"> SEQ </w:instrText>
+      </w:r>
+      <w:r>
+        <w:instrText>图表</w:instrText>
+      </w:r>
+      <w:r>
+        <w:instrText xml:space="preserve"> \* ARABIC </w:instrText>
+      </w:r>
+      <w:r>
+        <w:fldChar w:fldCharType="separate"/>
+      </w:r>
+      <w:r>
+        <w:rPr>
+          <w:noProof/>
+        </w:rPr>
+        <w:t>1</w:t>
+      </w:r>
+      <w:r>
+        <w:fldChar w:fldCharType="end"/>
+      </w:r>
+      <w:r>
         <w:rPr>
           <w:rFonts w:hint="eastAsia"/>
         </w:rPr>
-      </w:pPr>
-      <w:r>
-        <w:t>图</w:t>
-      </w:r>
-      <w:r>
         <w:t xml:space="preserve"> </w:t>
       </w:r>
       <w:r>
-        <w:fldChar w:fldCharType="begin"/>
-      </w:r>
-      <w:r>
-        <w:instrText xml:space="preserve"> SEQ </w:instrText>
-      </w:r>
-      <w:r>
-        <w:instrText>图表</w:instrText>
-      </w:r>
-      <w:r>
-        <w:instrText xml:space="preserve"> \* ARABIC </w:instrText>
-      </w:r>
-      <w:r>
-        <w:fldChar w:fldCharType="separate"/>
-      </w:r>
-      <w:r>
-        <w:rPr>
-          <w:noProof/>
+        <w:rPr>
+          <w:rFonts w:hint="eastAsia"/>
+        </w:rPr>
+        <w:t>概览</w:t>
+      </w:r>
+      <w:r>
+        <w:rPr>
+          <w:rFonts w:hint="eastAsia"/>
+        </w:rPr>
+        <w:t>AI</w:t>
+      </w:r>
+      <w:r>
+        <w:rPr>
+          <w:rFonts w:hint="eastAsia"/>
+        </w:rPr>
+        <w:t>助教的工作流程：我们结合了多种技术，包括（</w:t>
+      </w:r>
+      <w:r>
+        <w:rPr>
+          <w:rFonts w:hint="eastAsia"/>
         </w:rPr>
         <w:t>1</w:t>
       </w:r>
       <w:r>
-        <w:fldChar w:fldCharType="end"/>
-      </w:r>
-      <w:r>
         <w:rPr>
           <w:rFonts w:hint="eastAsia"/>
         </w:rPr>
-        <w:t xml:space="preserve"> </w:t>
+        <w:t>）检索增强生成（</w:t>
       </w:r>
       <w:r>
         <w:rPr>
           <w:rFonts w:hint="eastAsia"/>
         </w:rPr>
-        <w:t>概览</w:t>
+        <w:t>RAG</w:t>
       </w:r>
       <w:r>
         <w:rPr>
           <w:rFonts w:hint="eastAsia"/>
         </w:rPr>
-        <w:t>AI</w:t>
+        <w:t>）使用课程材料，（</w:t>
       </w:r>
       <w:r>
         <w:rPr>
           <w:rFonts w:hint="eastAsia"/>
         </w:rPr>
-        <w:t>助教的工作流程：我们结合了多种技术，包括（</w:t>
+        <w:t>2</w:t>
       </w:r>
       <w:r>
         <w:rPr>
           <w:rFonts w:hint="eastAsia"/>
         </w:rPr>
-        <w:t>1</w:t>
+        <w:t>）监督微调（</w:t>
       </w:r>
       <w:r>
         <w:rPr>
           <w:rFonts w:hint="eastAsia"/>
         </w:rPr>
-        <w:t>）检索增强生成（</w:t>
+        <w:t>SFT</w:t>
       </w:r>
       <w:r>
         <w:rPr>
           <w:rFonts w:hint="eastAsia"/>
         </w:rPr>
-        <w:t>RAG</w:t>
+        <w:t>）使用</w:t>
       </w:r>
       <w:r>
         <w:rPr>
           <w:rFonts w:hint="eastAsia"/>
         </w:rPr>
-        <w:t>）使用课程材料，（</w:t>
+        <w:t xml:space="preserve">Piazza </w:t>
       </w:r>
       <w:r>
         <w:rPr>
           <w:rFonts w:hint="eastAsia"/>
         </w:rPr>
-        <w:t>2</w:t>
+        <w:t>问答数据，以及（</w:t>
       </w:r>
       <w:r>
         <w:rPr>
           <w:rFonts w:hint="eastAsia"/>
         </w:rPr>
-        <w:t>）监督微调（</w:t>
+        <w:t>3</w:t>
       </w:r>
       <w:r>
         <w:rPr>
           <w:rFonts w:hint="eastAsia"/>
         </w:rPr>
-        <w:t>SFT</w:t>
+        <w:t>）学习人类喜好，通过直接偏好优化算法（</w:t>
       </w:r>
       <w:r>
         <w:rPr>
           <w:rFonts w:hint="eastAsia"/>
         </w:rPr>
-        <w:t>）使用</w:t>
+        <w:t>DPO</w:t>
       </w:r>
       <w:r>
         <w:rPr>
           <w:rFonts w:hint="eastAsia"/>
         </w:rPr>
-        <w:t xml:space="preserve">Piazza </w:t>
+        <w:t>）作为</w:t>
+      </w:r>
+      <w:r>
+        <w:t>基于人类反馈的强化学习方法</w:t>
       </w:r>
       <w:r>
         <w:rPr>
           <w:rFonts w:hint="eastAsia"/>
         </w:rPr>
-        <w:t>问答数据，以及（</w:t>
+        <w:t>（</w:t>
       </w:r>
       <w:r>
         <w:rPr>
           <w:rFonts w:hint="eastAsia"/>
         </w:rPr>
-        <w:t>3</w:t>
+        <w:t>RLHF</w:t>
       </w:r>
       <w:r>
         <w:rPr>
           <w:rFonts w:hint="eastAsia"/>
         </w:rPr>
-        <w:t>）学习人类喜好，通过直接偏好优化算法（</w:t>
-      </w:r>
-      <w:r>
-        <w:rPr>
-          <w:rFonts w:hint="eastAsia"/>
-        </w:rPr>
-        <w:t>DPO</w:t>
-      </w:r>
-      <w:r>
-        <w:rPr>
-          <w:rFonts w:hint="eastAsia"/>
-        </w:rPr>
-        <w:t>）作为</w:t>
-      </w:r>
-      <w:r>
-        <w:t>基于人类反馈的强化学习方法</w:t>
-      </w:r>
-      <w:r>
-        <w:rPr>
-          <w:rFonts w:hint="eastAsia"/>
-        </w:rPr>
-        <w:t>（</w:t>
-      </w:r>
-      <w:r>
-        <w:rPr>
-          <w:rFonts w:hint="eastAsia"/>
-        </w:rPr>
-        <w:t>RLHF</w:t>
-      </w:r>
-      <w:r>
-        <w:rPr>
-          <w:rFonts w:hint="eastAsia"/>
-        </w:rPr>
         <w:t>）的代理。</w:t>
       </w:r>
     </w:p>
     <w:p>
       <w:pPr>
         <w:rPr>
-          <w:rFonts w:ascii="宋体" w:eastAsia="宋体" w:hAnsi="宋体" w:hint="eastAsia"/>
+          <w:rFonts w:ascii="宋体" w:eastAsia="宋体" w:hAnsi="宋体"/>
           <w:b/>
           <w:bCs/>
           <w:sz w:val="28"/>
@@ -747,9 +815,9 @@
     </w:p>
     <w:p>
       <w:pPr>
-        <w:ind w:firstLineChars="200" w:firstLine="562"/>
-        <w:rPr>
-          <w:rFonts w:ascii="宋体" w:eastAsia="宋体" w:hAnsi="宋体" w:hint="eastAsia"/>
+        <w:ind w:firstLineChars="200" w:firstLine="571"/>
+        <w:rPr>
+          <w:rFonts w:ascii="宋体" w:eastAsia="宋体" w:hAnsi="宋体"/>
           <w:sz w:val="28"/>
           <w:szCs w:val="28"/>
         </w:rPr>
@@ -775,9 +843,9 @@
     </w:p>
     <w:p>
       <w:pPr>
-        <w:ind w:firstLineChars="200" w:firstLine="562"/>
-        <w:rPr>
-          <w:rFonts w:ascii="宋体" w:eastAsia="宋体" w:hAnsi="宋体" w:hint="eastAsia"/>
+        <w:ind w:firstLineChars="200" w:firstLine="571"/>
+        <w:rPr>
+          <w:rFonts w:ascii="宋体" w:eastAsia="宋体" w:hAnsi="宋体"/>
           <w:sz w:val="28"/>
           <w:szCs w:val="28"/>
         </w:rPr>
@@ -814,7 +882,7 @@
       <w:pPr>
         <w:ind w:firstLineChars="200" w:firstLine="560"/>
         <w:rPr>
-          <w:rFonts w:ascii="宋体" w:eastAsia="宋体" w:hAnsi="宋体" w:hint="eastAsia"/>
+          <w:rFonts w:ascii="宋体" w:eastAsia="宋体" w:hAnsi="宋体"/>
           <w:sz w:val="28"/>
           <w:szCs w:val="28"/>
         </w:rPr>
@@ -846,9 +914,9 @@
     </w:p>
     <w:p>
       <w:pPr>
-        <w:ind w:firstLineChars="200" w:firstLine="562"/>
-        <w:rPr>
-          <w:rFonts w:ascii="宋体" w:eastAsia="宋体" w:hAnsi="宋体" w:hint="eastAsia"/>
+        <w:ind w:firstLineChars="200" w:firstLine="571"/>
+        <w:rPr>
+          <w:rFonts w:ascii="宋体" w:eastAsia="宋体" w:hAnsi="宋体"/>
           <w:sz w:val="28"/>
           <w:szCs w:val="28"/>
         </w:rPr>
@@ -950,9 +1018,9 @@
     </w:p>
     <w:p>
       <w:pPr>
-        <w:ind w:firstLineChars="200" w:firstLine="562"/>
-        <w:rPr>
-          <w:rFonts w:ascii="宋体" w:eastAsia="宋体" w:hAnsi="宋体" w:hint="eastAsia"/>
+        <w:ind w:firstLineChars="200" w:firstLine="571"/>
+        <w:rPr>
+          <w:rFonts w:ascii="宋体" w:eastAsia="宋体" w:hAnsi="宋体"/>
           <w:sz w:val="28"/>
           <w:szCs w:val="28"/>
         </w:rPr>
@@ -978,9 +1046,9 @@
     </w:p>
     <w:p>
       <w:pPr>
-        <w:ind w:firstLineChars="200" w:firstLine="562"/>
-        <w:rPr>
-          <w:rFonts w:ascii="宋体" w:eastAsia="宋体" w:hAnsi="宋体" w:hint="eastAsia"/>
+        <w:ind w:firstLineChars="200" w:firstLine="571"/>
+        <w:rPr>
+          <w:rFonts w:ascii="宋体" w:eastAsia="宋体" w:hAnsi="宋体"/>
           <w:b/>
           <w:bCs/>
           <w:sz w:val="28"/>
@@ -1004,7 +1072,25 @@
           <w:sz w:val="28"/>
           <w:szCs w:val="28"/>
         </w:rPr>
-        <w:t>：先前在不同领域的工作一直在使用微调的开源大语言模型，并且通过不同技术手段来增强他们，例如RAG和RLHF。例如，在医疗和康复领域的ClinicalGPT微调了Bloom</w:t>
+        <w:t>：先前在不同领域的工作一直在使用微调的开源大语言模型，并且通过不同技术手段来增强他们，例如RAG和RLHF。例如，在医疗和康复领域的</w:t>
+      </w:r>
+      <w:proofErr w:type="spellStart"/>
+      <w:r>
+        <w:rPr>
+          <w:rFonts w:ascii="宋体" w:eastAsia="宋体" w:hAnsi="宋体" w:hint="eastAsia"/>
+          <w:sz w:val="28"/>
+          <w:szCs w:val="28"/>
+        </w:rPr>
+        <w:t>ClinicalGPT</w:t>
+      </w:r>
+      <w:proofErr w:type="spellEnd"/>
+      <w:r>
+        <w:rPr>
+          <w:rFonts w:ascii="宋体" w:eastAsia="宋体" w:hAnsi="宋体" w:hint="eastAsia"/>
+          <w:sz w:val="28"/>
+          <w:szCs w:val="28"/>
+        </w:rPr>
+        <w:t>微调了Bloom</w:t>
       </w:r>
       <w:r>
         <w:rPr>
@@ -1062,7 +1148,7 @@
           <w:numId w:val="1"/>
         </w:numPr>
         <w:rPr>
-          <w:rFonts w:ascii="宋体" w:eastAsia="宋体" w:hAnsi="宋体" w:hint="eastAsia"/>
+          <w:rFonts w:ascii="宋体" w:eastAsia="宋体" w:hAnsi="宋体"/>
           <w:b/>
           <w:bCs/>
           <w:sz w:val="28"/>
@@ -1084,18 +1170,36 @@
       <w:pPr>
         <w:ind w:firstLineChars="200" w:firstLine="560"/>
         <w:rPr>
-          <w:rFonts w:ascii="宋体" w:eastAsia="宋体" w:hAnsi="宋体" w:hint="eastAsia"/>
-          <w:sz w:val="28"/>
-          <w:szCs w:val="28"/>
-        </w:rPr>
-      </w:pPr>
-      <w:r>
-        <w:rPr>
-          <w:rFonts w:ascii="宋体" w:eastAsia="宋体" w:hAnsi="宋体" w:hint="eastAsia"/>
-          <w:sz w:val="28"/>
-          <w:szCs w:val="28"/>
-        </w:rPr>
-        <w:t>在我们的实验中，我们利用了先前匿名化的Piazza问答数据集，内容涵盖了从2015至2022年8个学期的大规模C语言和Matlab编程导论课，这些课程被在新西兰的一所公立研究型大学教授。数据集总共由10647个问答对组成。我们保留了自2022年起的717个问答对用于评估使用，由于预算和计算资源限制，我们由从中进一步随机筛选了一个由236个问答对组成的子集。另外，我们获取了2022学期的导论材料，包括</w:t>
+          <w:rFonts w:ascii="宋体" w:eastAsia="宋体" w:hAnsi="宋体"/>
+          <w:sz w:val="28"/>
+          <w:szCs w:val="28"/>
+        </w:rPr>
+      </w:pPr>
+      <w:r>
+        <w:rPr>
+          <w:rFonts w:ascii="宋体" w:eastAsia="宋体" w:hAnsi="宋体" w:hint="eastAsia"/>
+          <w:sz w:val="28"/>
+          <w:szCs w:val="28"/>
+        </w:rPr>
+        <w:t>在我们的实验中，我们利用了先前匿名化的Piazza问答数据集，内容涵盖了从2015至2022年8个学期的大规模C语言和</w:t>
+      </w:r>
+      <w:proofErr w:type="spellStart"/>
+      <w:r>
+        <w:rPr>
+          <w:rFonts w:ascii="宋体" w:eastAsia="宋体" w:hAnsi="宋体" w:hint="eastAsia"/>
+          <w:sz w:val="28"/>
+          <w:szCs w:val="28"/>
+        </w:rPr>
+        <w:t>Matlab</w:t>
+      </w:r>
+      <w:proofErr w:type="spellEnd"/>
+      <w:r>
+        <w:rPr>
+          <w:rFonts w:ascii="宋体" w:eastAsia="宋体" w:hAnsi="宋体" w:hint="eastAsia"/>
+          <w:sz w:val="28"/>
+          <w:szCs w:val="28"/>
+        </w:rPr>
+        <w:t>编程导论课，这些课程被在新西兰的一所公立研究型大学教授。数据集总共由10647个问答对组成。我们保留了自2022年起的717个问答对用于评估使用，由于预算和计算资源限制，我们由从中进一步随机筛选了一个由236个问答对组成的子集。另外，我们获取了2022学期的导论材料，包括</w:t>
       </w:r>
       <w:r>
         <w:rPr>
@@ -1116,9 +1220,9 @@
     </w:p>
     <w:p>
       <w:pPr>
-        <w:ind w:firstLineChars="200" w:firstLine="562"/>
-        <w:rPr>
-          <w:rFonts w:ascii="宋体" w:eastAsia="宋体" w:hAnsi="宋体" w:hint="eastAsia"/>
+        <w:ind w:firstLineChars="200" w:firstLine="571"/>
+        <w:rPr>
+          <w:rFonts w:ascii="宋体" w:eastAsia="宋体" w:hAnsi="宋体"/>
           <w:sz w:val="28"/>
           <w:szCs w:val="28"/>
         </w:rPr>
@@ -1187,7 +1291,7 @@
       <w:pPr>
         <w:ind w:firstLineChars="200" w:firstLine="560"/>
         <w:rPr>
-          <w:rFonts w:ascii="宋体" w:eastAsia="宋体" w:hAnsi="宋体" w:hint="eastAsia"/>
+          <w:rFonts w:ascii="宋体" w:eastAsia="宋体" w:hAnsi="宋体"/>
           <w:sz w:val="28"/>
           <w:szCs w:val="28"/>
         </w:rPr>
@@ -1253,7 +1357,7 @@
       <w:pPr>
         <w:ind w:firstLineChars="200" w:firstLine="560"/>
         <w:rPr>
-          <w:rFonts w:ascii="宋体" w:eastAsia="宋体" w:hAnsi="宋体" w:hint="eastAsia"/>
+          <w:rFonts w:ascii="宋体" w:eastAsia="宋体" w:hAnsi="宋体"/>
           <w:sz w:val="28"/>
           <w:szCs w:val="28"/>
         </w:rPr>
@@ -1298,7 +1402,7 @@
           <w:numId w:val="1"/>
         </w:numPr>
         <w:rPr>
-          <w:rFonts w:ascii="宋体" w:eastAsia="宋体" w:hAnsi="宋体" w:hint="eastAsia"/>
+          <w:rFonts w:ascii="宋体" w:eastAsia="宋体" w:hAnsi="宋体"/>
           <w:b/>
           <w:bCs/>
           <w:sz w:val="28"/>
@@ -1320,7 +1424,7 @@
       <w:pPr>
         <w:ind w:firstLineChars="200" w:firstLine="560"/>
         <w:rPr>
-          <w:rFonts w:ascii="宋体" w:eastAsia="宋体" w:hAnsi="宋体" w:hint="eastAsia"/>
+          <w:rFonts w:ascii="宋体" w:eastAsia="宋体" w:hAnsi="宋体"/>
           <w:sz w:val="28"/>
           <w:szCs w:val="28"/>
         </w:rPr>
@@ -1344,9 +1448,9 @@
     </w:p>
     <w:p>
       <w:pPr>
-        <w:ind w:firstLineChars="200" w:firstLine="562"/>
-        <w:rPr>
-          <w:rFonts w:ascii="宋体" w:eastAsia="宋体" w:hAnsi="宋体" w:hint="eastAsia"/>
+        <w:ind w:firstLineChars="200" w:firstLine="571"/>
+        <w:rPr>
+          <w:rFonts w:ascii="宋体" w:eastAsia="宋体" w:hAnsi="宋体"/>
           <w:sz w:val="28"/>
           <w:szCs w:val="28"/>
         </w:rPr>
@@ -1397,9 +1501,9 @@
     </w:p>
     <w:p>
       <w:pPr>
-        <w:ind w:firstLineChars="200" w:firstLine="562"/>
-        <w:rPr>
-          <w:rFonts w:ascii="宋体" w:eastAsia="宋体" w:hAnsi="宋体" w:hint="eastAsia"/>
+        <w:ind w:firstLineChars="200" w:firstLine="571"/>
+        <w:rPr>
+          <w:rFonts w:ascii="宋体" w:eastAsia="宋体" w:hAnsi="宋体"/>
           <w:sz w:val="28"/>
           <w:szCs w:val="28"/>
         </w:rPr>
@@ -1449,9 +1553,9 @@
     </w:p>
     <w:p>
       <w:pPr>
-        <w:ind w:firstLineChars="200" w:firstLine="562"/>
-        <w:rPr>
-          <w:rFonts w:ascii="宋体" w:eastAsia="宋体" w:hAnsi="宋体" w:hint="eastAsia"/>
+        <w:ind w:firstLineChars="200" w:firstLine="571"/>
+        <w:rPr>
+          <w:rFonts w:ascii="宋体" w:eastAsia="宋体" w:hAnsi="宋体"/>
           <w:sz w:val="28"/>
           <w:szCs w:val="28"/>
         </w:rPr>
@@ -1477,9 +1581,9 @@
     </w:p>
     <w:p>
       <w:pPr>
-        <w:ind w:firstLineChars="200" w:firstLine="562"/>
-        <w:rPr>
-          <w:rFonts w:ascii="宋体" w:eastAsia="宋体" w:hAnsi="宋体" w:hint="eastAsia"/>
+        <w:ind w:firstLineChars="200" w:firstLine="571"/>
+        <w:rPr>
+          <w:rFonts w:ascii="宋体" w:eastAsia="宋体" w:hAnsi="宋体"/>
           <w:sz w:val="28"/>
           <w:szCs w:val="28"/>
         </w:rPr>
@@ -1524,14 +1628,32 @@
           <w:sz w:val="28"/>
           <w:szCs w:val="28"/>
         </w:rPr>
-        <w:t>我们在4比特配置下加载我们的模型，并且通过QLora方法来训练我们的模型。</w:t>
-      </w:r>
-    </w:p>
-    <w:p>
-      <w:pPr>
-        <w:ind w:firstLineChars="200" w:firstLine="562"/>
-        <w:rPr>
-          <w:rFonts w:ascii="宋体" w:eastAsia="宋体" w:hAnsi="宋体" w:hint="eastAsia"/>
+        <w:t>我们在4比特配置下加载我们的模型，并且通过</w:t>
+      </w:r>
+      <w:proofErr w:type="spellStart"/>
+      <w:r>
+        <w:rPr>
+          <w:rFonts w:ascii="宋体" w:eastAsia="宋体" w:hAnsi="宋体" w:hint="eastAsia"/>
+          <w:sz w:val="28"/>
+          <w:szCs w:val="28"/>
+        </w:rPr>
+        <w:t>QLora</w:t>
+      </w:r>
+      <w:proofErr w:type="spellEnd"/>
+      <w:r>
+        <w:rPr>
+          <w:rFonts w:ascii="宋体" w:eastAsia="宋体" w:hAnsi="宋体" w:hint="eastAsia"/>
+          <w:sz w:val="28"/>
+          <w:szCs w:val="28"/>
+        </w:rPr>
+        <w:t>方法来训练我们的模型。</w:t>
+      </w:r>
+    </w:p>
+    <w:p>
+      <w:pPr>
+        <w:ind w:firstLineChars="200" w:firstLine="571"/>
+        <w:rPr>
+          <w:rFonts w:ascii="宋体" w:eastAsia="宋体" w:hAnsi="宋体"/>
           <w:sz w:val="28"/>
           <w:szCs w:val="28"/>
         </w:rPr>
@@ -1620,7 +1742,7 @@
     </w:p>
     <w:p>
       <w:pPr>
-        <w:ind w:firstLineChars="200" w:firstLine="562"/>
+        <w:ind w:firstLineChars="200" w:firstLine="571"/>
         <w:rPr>
           <w:rFonts w:ascii="宋体" w:eastAsia="宋体" w:hAnsi="宋体"/>
           <w:sz w:val="28"/>
@@ -1654,7 +1776,7 @@
           <w:numId w:val="3"/>
         </w:numPr>
         <w:rPr>
-          <w:rFonts w:ascii="宋体" w:eastAsia="宋体" w:hAnsi="宋体" w:hint="eastAsia"/>
+          <w:rFonts w:ascii="宋体" w:eastAsia="宋体" w:hAnsi="宋体"/>
           <w:sz w:val="28"/>
           <w:szCs w:val="28"/>
         </w:rPr>
@@ -1743,7 +1865,7 @@
           <w:numId w:val="3"/>
         </w:numPr>
         <w:rPr>
-          <w:rFonts w:ascii="宋体" w:eastAsia="宋体" w:hAnsi="宋体" w:hint="eastAsia"/>
+          <w:rFonts w:ascii="宋体" w:eastAsia="宋体" w:hAnsi="宋体"/>
           <w:sz w:val="28"/>
           <w:szCs w:val="28"/>
         </w:rPr>
@@ -1780,7 +1902,25 @@
           <w:sz w:val="28"/>
           <w:szCs w:val="28"/>
         </w:rPr>
-        <w:t>然而，GPT-4也表现出更喜欢Instruct-GPT家族模型所生成的答案。在我们的实验中，我们通过提示词让GPT-4用与人类评估相同的评分细则来评估了9个模型生成的236个问题的答案。我们的提示词（见附录E）由AlpacaEval框</w:t>
+        <w:t>然而，GPT-4也表现出更喜欢Instruct-GPT家族模型所生成的答案。在我们的实验中，我们通过提示词让GPT-4用与人类评估相同的评分细则来评估了9个模型生成的236个问题的答案。我们的提示词（见附录E）由</w:t>
+      </w:r>
+      <w:proofErr w:type="spellStart"/>
+      <w:r>
+        <w:rPr>
+          <w:rFonts w:ascii="宋体" w:eastAsia="宋体" w:hAnsi="宋体" w:hint="eastAsia"/>
+          <w:sz w:val="28"/>
+          <w:szCs w:val="28"/>
+        </w:rPr>
+        <w:t>AlpacaEval</w:t>
+      </w:r>
+      <w:proofErr w:type="spellEnd"/>
+      <w:r>
+        <w:rPr>
+          <w:rFonts w:ascii="宋体" w:eastAsia="宋体" w:hAnsi="宋体" w:hint="eastAsia"/>
+          <w:sz w:val="28"/>
+          <w:szCs w:val="28"/>
+        </w:rPr>
+        <w:t>框</w:t>
       </w:r>
       <w:r>
         <w:rPr>
@@ -1794,8 +1934,425 @@
     </w:p>
     <w:p>
       <w:pPr>
-        <w:rPr>
-          <w:rFonts w:ascii="宋体" w:eastAsia="宋体" w:hAnsi="宋体" w:hint="eastAsia"/>
+        <w:numPr>
+          <w:ilvl w:val="0"/>
+          <w:numId w:val="1"/>
+        </w:numPr>
+        <w:rPr>
+          <w:rFonts w:ascii="宋体" w:eastAsia="宋体" w:hAnsi="宋体"/>
+          <w:b/>
+          <w:bCs/>
+          <w:sz w:val="28"/>
+          <w:szCs w:val="28"/>
+        </w:rPr>
+      </w:pPr>
+      <w:r>
+        <w:rPr>
+          <w:rFonts w:ascii="宋体" w:eastAsia="宋体" w:hAnsi="宋体" w:hint="eastAsia"/>
+          <w:b/>
+          <w:bCs/>
+          <w:sz w:val="28"/>
+          <w:szCs w:val="28"/>
+        </w:rPr>
+        <w:t>结果</w:t>
+      </w:r>
+    </w:p>
+    <w:p>
+      <w:pPr>
+        <w:ind w:firstLineChars="200" w:firstLine="560"/>
+        <w:rPr>
+          <w:rFonts w:ascii="宋体" w:eastAsia="宋体" w:hAnsi="宋体"/>
+          <w:sz w:val="28"/>
+          <w:szCs w:val="28"/>
+        </w:rPr>
+      </w:pPr>
+      <w:r>
+        <w:rPr>
+          <w:rFonts w:ascii="宋体" w:eastAsia="宋体" w:hAnsi="宋体" w:hint="eastAsia"/>
+          <w:sz w:val="28"/>
+          <w:szCs w:val="28"/>
+        </w:rPr>
+        <w:t>对人类评估，我们评估了基于</w:t>
+      </w:r>
+      <w:r>
+        <w:rPr>
+          <w:rFonts w:ascii="宋体" w:eastAsia="宋体" w:hAnsi="宋体" w:hint="eastAsia"/>
+          <w:sz w:val="28"/>
+          <w:szCs w:val="28"/>
+        </w:rPr>
+        <w:t>9个不同的模型</w:t>
+      </w:r>
+      <w:r>
+        <w:rPr>
+          <w:rFonts w:ascii="宋体" w:eastAsia="宋体" w:hAnsi="宋体" w:hint="eastAsia"/>
+          <w:sz w:val="28"/>
+          <w:szCs w:val="28"/>
+        </w:rPr>
+        <w:t>的</w:t>
+      </w:r>
+      <w:r>
+        <w:rPr>
+          <w:rFonts w:ascii="宋体" w:eastAsia="宋体" w:hAnsi="宋体" w:hint="eastAsia"/>
+          <w:sz w:val="28"/>
+          <w:szCs w:val="28"/>
+        </w:rPr>
+        <w:t>20个问题</w:t>
+      </w:r>
+      <w:r>
+        <w:rPr>
+          <w:rFonts w:ascii="宋体" w:eastAsia="宋体" w:hAnsi="宋体" w:hint="eastAsia"/>
+          <w:sz w:val="28"/>
+          <w:szCs w:val="28"/>
+        </w:rPr>
+        <w:t>。对于</w:t>
+      </w:r>
+      <w:proofErr w:type="spellStart"/>
+      <w:r>
+        <w:rPr>
+          <w:rFonts w:ascii="宋体" w:eastAsia="宋体" w:hAnsi="宋体" w:hint="eastAsia"/>
+          <w:sz w:val="28"/>
+          <w:szCs w:val="28"/>
+        </w:rPr>
+        <w:t>BertScore</w:t>
+      </w:r>
+      <w:proofErr w:type="spellEnd"/>
+      <w:r>
+        <w:rPr>
+          <w:rFonts w:ascii="宋体" w:eastAsia="宋体" w:hAnsi="宋体" w:hint="eastAsia"/>
+          <w:sz w:val="28"/>
+          <w:szCs w:val="28"/>
+        </w:rPr>
+        <w:t>和基于大语言模型的评估，我们评估了基于9个不同的模型的236个问题。分数总结在表格1中。请参考附录D中的表格5中的示例结果和对各模型的评分。</w:t>
+      </w:r>
+    </w:p>
+    <w:p>
+      <w:pPr>
+        <w:pStyle w:val="ae"/>
+        <w:keepNext/>
+        <w:rPr>
+          <w:rFonts w:hint="eastAsia"/>
+        </w:rPr>
+      </w:pPr>
+      <w:r>
+        <w:t>表格</w:t>
+      </w:r>
+      <w:r>
+        <w:t xml:space="preserve"> </w:t>
+      </w:r>
+      <w:r>
+        <w:fldChar w:fldCharType="begin"/>
+      </w:r>
+      <w:r>
+        <w:instrText xml:space="preserve"> SEQ </w:instrText>
+      </w:r>
+      <w:r>
+        <w:instrText>表格</w:instrText>
+      </w:r>
+      <w:r>
+        <w:instrText xml:space="preserve"> \* ARABIC </w:instrText>
+      </w:r>
+      <w:r>
+        <w:fldChar w:fldCharType="separate"/>
+      </w:r>
+      <w:r>
+        <w:rPr>
+          <w:noProof/>
+        </w:rPr>
+        <w:t>1</w:t>
+      </w:r>
+      <w:r>
+        <w:fldChar w:fldCharType="end"/>
+      </w:r>
+      <w:r>
+        <w:rPr>
+          <w:rFonts w:hint="eastAsia"/>
+        </w:rPr>
+        <w:t>：</w:t>
+      </w:r>
+      <w:proofErr w:type="spellStart"/>
+      <w:r>
+        <w:rPr>
+          <w:rFonts w:hint="eastAsia"/>
+        </w:rPr>
+        <w:t>BertScore</w:t>
+      </w:r>
+      <w:proofErr w:type="spellEnd"/>
+      <w:r>
+        <w:rPr>
+          <w:rFonts w:hint="eastAsia"/>
+        </w:rPr>
+        <w:t>，人类评估分数和大模型评估分数（平均分正负加减标准差）作为各自的评分标准。加粗数字表示在开源和闭源大模型中的最好表现。注意，该评估是在</w:t>
+      </w:r>
+      <w:r>
+        <w:t/>
+      </w:r>
+      <w:r>
+        <w:rPr>
+          <w:rFonts w:hint="eastAsia"/>
+        </w:rPr>
+        <w:t>LLaMA</w:t>
+      </w:r>
+      <w:r>
+        <w:t>-2</w:t>
+      </w:r>
+      <w:r>
+        <w:rPr>
+          <w:rFonts w:hint="eastAsia"/>
+        </w:rPr>
+        <w:t>模型的对话版本上完成的。</w:t>
+      </w:r>
+    </w:p>
+    <w:p>
+      <w:pPr>
+        <w:ind w:firstLineChars="200" w:firstLine="560"/>
+        <w:rPr>
+          <w:rFonts w:ascii="宋体" w:eastAsia="宋体" w:hAnsi="宋体"/>
+          <w:sz w:val="28"/>
+          <w:szCs w:val="28"/>
+        </w:rPr>
+      </w:pPr>
+      <w:r>
+        <w:rPr>
+          <w:rFonts w:ascii="宋体" w:eastAsia="宋体" w:hAnsi="宋体"/>
+          <w:sz w:val="28"/>
+          <w:szCs w:val="28"/>
+        </w:rPr>
+        <w:drawing>
+          <wp:inline distT="0" distB="0" distL="0" distR="0" wp14:anchorId="72C6F988" wp14:editId="1CCD67E7">
+            <wp:extent cx="5274310" cy="1645920"/>
+            <wp:effectExtent l="0" t="0" r="0" b="5080"/>
+            <wp:docPr id="486849889" name="图片 1"/>
+            <wp:cNvGraphicFramePr>
+              <a:graphicFrameLocks xmlns:a="http://schemas.openxmlformats.org/drawingml/2006/main" noChangeAspect="1"/>
+            </wp:cNvGraphicFramePr>
+            <a:graphic xmlns:a="http://schemas.openxmlformats.org/drawingml/2006/main">
+              <a:graphicData uri="http://schemas.openxmlformats.org/drawingml/2006/picture">
+                <pic:pic xmlns:pic="http://schemas.openxmlformats.org/drawingml/2006/picture">
+                  <pic:nvPicPr>
+                    <pic:cNvPr id="486849889" name=""/>
+                    <pic:cNvPicPr/>
+                  </pic:nvPicPr>
+                  <pic:blipFill>
+                    <a:blip r:embed="rId6"/>
+                    <a:stretch>
+                      <a:fillRect/>
+                    </a:stretch>
+                  </pic:blipFill>
+                  <pic:spPr>
+                    <a:xfrm>
+                      <a:off x="0" y="0"/>
+                      <a:ext cx="5274310" cy="1645920"/>
+                    </a:xfrm>
+                    <a:prstGeom prst="rect">
+                      <a:avLst/>
+                    </a:prstGeom>
+                  </pic:spPr>
+                </pic:pic>
+              </a:graphicData>
+            </a:graphic>
+          </wp:inline>
+        </w:drawing>
+      </w:r>
+    </w:p>
+    <w:p>
+      <w:pPr>
+        <w:ind w:firstLineChars="200" w:firstLine="560"/>
+        <w:rPr>
+          <w:rFonts w:ascii="宋体" w:eastAsia="宋体" w:hAnsi="宋体"/>
+          <w:sz w:val="28"/>
+          <w:szCs w:val="28"/>
+        </w:rPr>
+      </w:pPr>
+      <w:r>
+        <w:rPr>
+          <w:rFonts w:ascii="宋体" w:eastAsia="宋体" w:hAnsi="宋体" w:hint="eastAsia"/>
+          <w:sz w:val="28"/>
+          <w:szCs w:val="28"/>
+        </w:rPr>
+        <w:t>5.1 人类评估</w:t>
+      </w:r>
+    </w:p>
+    <w:p>
+      <w:pPr>
+        <w:ind w:firstLineChars="200" w:firstLine="571"/>
+        <w:rPr>
+          <w:rFonts w:ascii="宋体" w:eastAsia="宋体" w:hAnsi="宋体"/>
+          <w:sz w:val="28"/>
+          <w:szCs w:val="28"/>
+        </w:rPr>
+      </w:pPr>
+      <w:r>
+        <w:rPr>
+          <w:rFonts w:ascii="宋体" w:eastAsia="宋体" w:hAnsi="宋体" w:hint="eastAsia"/>
+          <w:b/>
+          <w:bCs/>
+          <w:sz w:val="28"/>
+          <w:szCs w:val="28"/>
+        </w:rPr>
+        <w:t>基座模型的表现都相似，随着参数量增多表现会进步，GPT</w:t>
+      </w:r>
+      <w:r>
+        <w:rPr>
+          <w:rFonts w:ascii="宋体" w:eastAsia="宋体" w:hAnsi="宋体"/>
+          <w:b/>
+          <w:bCs/>
+          <w:sz w:val="28"/>
+          <w:szCs w:val="28"/>
+        </w:rPr>
+        <w:t>-4</w:t>
+      </w:r>
+      <w:r>
+        <w:rPr>
+          <w:rFonts w:ascii="宋体" w:eastAsia="宋体" w:hAnsi="宋体" w:hint="eastAsia"/>
+          <w:b/>
+          <w:bCs/>
+          <w:sz w:val="28"/>
+          <w:szCs w:val="28"/>
+        </w:rPr>
+        <w:t>有着最好的表现。</w:t>
+      </w:r>
+      <w:r>
+        <w:rPr>
+          <w:rFonts w:ascii="宋体" w:eastAsia="宋体" w:hAnsi="宋体" w:hint="eastAsia"/>
+          <w:sz w:val="28"/>
+          <w:szCs w:val="28"/>
+        </w:rPr>
+        <w:t>根据人类评估的分数，基座模型的表现会随着参数量的增加而进步，GPT-4会有最好的表现。不同参数量大小的</w:t>
+      </w:r>
+      <w:proofErr w:type="spellStart"/>
+      <w:r>
+        <w:rPr>
+          <w:rFonts w:ascii="宋体" w:eastAsia="宋体" w:hAnsi="宋体"/>
+          <w:sz w:val="28"/>
+          <w:szCs w:val="28"/>
+        </w:rPr>
+        <w:t>LLaMA</w:t>
+      </w:r>
+      <w:proofErr w:type="spellEnd"/>
+      <w:r>
+        <w:rPr>
+          <w:rFonts w:ascii="宋体" w:eastAsia="宋体" w:hAnsi="宋体" w:hint="eastAsia"/>
+          <w:sz w:val="28"/>
+          <w:szCs w:val="28"/>
+        </w:rPr>
+        <w:t>模型（7</w:t>
+      </w:r>
+      <w:r>
+        <w:rPr>
+          <w:rFonts w:ascii="宋体" w:eastAsia="宋体" w:hAnsi="宋体"/>
+          <w:sz w:val="28"/>
+          <w:szCs w:val="28"/>
+        </w:rPr>
+        <w:t>B,13B,70B</w:t>
+      </w:r>
+      <w:r>
+        <w:rPr>
+          <w:rFonts w:ascii="宋体" w:eastAsia="宋体" w:hAnsi="宋体" w:hint="eastAsia"/>
+          <w:sz w:val="28"/>
+          <w:szCs w:val="28"/>
+        </w:rPr>
+        <w:t>）不会生成截然不同的答案，尽管更大的模型会有表现得有一些更好。然而，在评价基座模型时会有一个较高的标准差，意味着它们的表现会有较大的波动取决于不同类型的问题。例如，没有检索上下文的</w:t>
+      </w:r>
+      <w:r>
+        <w:rPr>
+          <w:rFonts w:ascii="宋体" w:eastAsia="宋体" w:hAnsi="宋体" w:hint="eastAsia"/>
+          <w:sz w:val="28"/>
+          <w:szCs w:val="28"/>
+        </w:rPr>
+        <w:t>模型</w:t>
+      </w:r>
+      <w:r>
+        <w:rPr>
+          <w:rFonts w:ascii="宋体" w:eastAsia="宋体" w:hAnsi="宋体" w:hint="eastAsia"/>
+          <w:sz w:val="28"/>
+          <w:szCs w:val="28"/>
+        </w:rPr>
+        <w:t>会在处理逻辑相关问题比如作业题时表现较差，但会在概念题上表现较好，比如解释C语言的代码语法。</w:t>
+      </w:r>
+    </w:p>
+    <w:p>
+      <w:pPr>
+        <w:ind w:firstLineChars="200" w:firstLine="571"/>
+        <w:rPr>
+          <w:rFonts w:ascii="宋体" w:eastAsia="宋体" w:hAnsi="宋体" w:hint="eastAsia"/>
+          <w:sz w:val="28"/>
+          <w:szCs w:val="28"/>
+        </w:rPr>
+      </w:pPr>
+      <w:r>
+        <w:rPr>
+          <w:rFonts w:ascii="宋体" w:eastAsia="宋体" w:hAnsi="宋体" w:hint="eastAsia"/>
+          <w:b/>
+          <w:bCs/>
+          <w:sz w:val="28"/>
+          <w:szCs w:val="28"/>
+        </w:rPr>
+        <w:t>不同的增强技术（SFT，DPO，RAG）会对表现有着不同的影响。</w:t>
+      </w:r>
+      <w:r>
+        <w:rPr>
+          <w:rFonts w:ascii="宋体" w:eastAsia="宋体" w:hAnsi="宋体" w:hint="eastAsia"/>
+          <w:sz w:val="28"/>
+          <w:szCs w:val="28"/>
+        </w:rPr>
+        <w:lastRenderedPageBreak/>
+        <w:t>从</w:t>
+      </w:r>
+      <w:r>
+        <w:rPr>
+          <w:rFonts w:ascii="宋体" w:eastAsia="宋体" w:hAnsi="宋体"/>
+          <w:sz w:val="28"/>
+          <w:szCs w:val="28"/>
+        </w:rPr>
+        <w:t>LLaMA-2-13b+SFT</w:t>
+      </w:r>
+      <w:r>
+        <w:rPr>
+          <w:rFonts w:ascii="宋体" w:eastAsia="宋体" w:hAnsi="宋体" w:hint="eastAsia"/>
+          <w:sz w:val="28"/>
+          <w:szCs w:val="28"/>
+        </w:rPr>
+        <w:t>相较于</w:t>
+      </w:r>
+      <w:r>
+        <w:rPr>
+          <w:rFonts w:ascii="宋体" w:eastAsia="宋体" w:hAnsi="宋体"/>
+          <w:sz w:val="28"/>
+          <w:szCs w:val="28"/>
+        </w:rPr>
+        <w:t>LLaMA-2-13b</w:t>
+      </w:r>
+      <w:r>
+        <w:rPr>
+          <w:rFonts w:ascii="宋体" w:eastAsia="宋体" w:hAnsi="宋体" w:hint="eastAsia"/>
+          <w:sz w:val="28"/>
+          <w:szCs w:val="28"/>
+        </w:rPr>
+        <w:t>基座模型会有13%的性能削弱的实验结果，可以看出</w:t>
+      </w:r>
+      <w:r>
+        <w:rPr>
+          <w:rFonts w:ascii="宋体" w:eastAsia="宋体" w:hAnsi="宋体" w:hint="eastAsia"/>
+          <w:i/>
+          <w:iCs/>
+          <w:sz w:val="28"/>
+          <w:szCs w:val="28"/>
+        </w:rPr>
+        <w:t>单独使用SFT并不会提升性能</w:t>
+      </w:r>
+      <w:r>
+        <w:rPr>
+          <w:rFonts w:ascii="宋体" w:eastAsia="宋体" w:hAnsi="宋体" w:hint="eastAsia"/>
+          <w:sz w:val="28"/>
+          <w:szCs w:val="28"/>
+        </w:rPr>
+        <w:t>。</w:t>
+      </w:r>
+    </w:p>
+    <w:p>
+      <w:pPr>
+        <w:rPr>
+          <w:rFonts w:ascii="宋体" w:eastAsia="宋体" w:hAnsi="宋体"/>
           <w:b/>
           <w:bCs/>
           <w:sz w:val="24"/>
@@ -1806,7 +2363,7 @@
     <w:p>
       <w:pPr>
         <w:rPr>
-          <w:rFonts w:ascii="宋体" w:eastAsia="宋体" w:hAnsi="宋体" w:hint="eastAsia"/>
+          <w:rFonts w:ascii="宋体" w:eastAsia="宋体" w:hAnsi="宋体"/>
           <w:b/>
           <w:bCs/>
           <w:sz w:val="24"/>
@@ -1837,7 +2394,7 @@
     <w:p>
       <w:pPr>
         <w:rPr>
-          <w:rFonts w:ascii="宋体" w:eastAsia="宋体" w:hAnsi="宋体" w:hint="eastAsia"/>
+          <w:rFonts w:ascii="宋体" w:eastAsia="宋体" w:hAnsi="宋体"/>
           <w:sz w:val="24"/>
           <w:szCs w:val="24"/>
         </w:rPr>
@@ -1851,13 +2408,7 @@
         <w:t>参考文献格式参照《信息与文献—参考文献著录规则》（GB/T 7714-2015），字体为宋体小四号。</w:t>
       </w:r>
     </w:p>
-    <w:p>
-      <w:pPr>
-        <w:rPr>
-          <w:rFonts w:hint="eastAsia"/>
-        </w:rPr>
-      </w:pPr>
-    </w:p>
+    <w:p/>
     <w:sectPr>
       <w:pgSz w:w="11906" w:h="16838"/>
       <w:pgMar w:top="1440" w:right="1800" w:bottom="1440" w:left="1800" w:header="851" w:footer="992" w:gutter="0"/>
@@ -2702,6 +3253,7 @@
   <w:style w:type="character" w:default="1" w:styleId="a0">
     <w:name w:val="Default Paragraph Font"/>
     <w:uiPriority w:val="1"/>
+    <w:semiHidden/>
     <w:unhideWhenUsed/>
   </w:style>
   <w:style w:type="table" w:default="1" w:styleId="a1">

</xml_diff>